<commit_message>
El kitaplari guncellendi: sayilar (63/17/188), Paladyum, alarm esigi, veri kaynagi tablosu, emoji temizligi, v2.0.7.76-88 versiyon gecmisi
</commit_message>
<xml_diff>
--- a/TrendSurf_Optima_Abone_El_Kitabi.docx
+++ b/TrendSurf_Optima_Abone_El_Kitabi.docx
@@ -68,6 +68,7 @@
           <w:bCs/>
         </w:rPr>
       </w:pPr>
+      <w:proofErr w:type="gramStart"/>
       <w:r>
         <w:rPr>
           <w:rStyle w:val="TrendPart"/>
@@ -97,7 +98,16 @@
           <w:b/>
           <w:bCs/>
         </w:rPr>
-        <w:t> OPTİMA </w:t>
+        <w:t> OPTİMA</w:t>
+      </w:r>
+      <w:proofErr w:type="gramEnd"/>
+      <w:r>
+        <w:rPr>
+          <w:rStyle w:val="OptimaPart"/>
+          <w:b/>
+          <w:bCs/>
+        </w:rPr>
+        <w:t> </w:t>
       </w:r>
     </w:p>
     <w:p>
@@ -543,8 +553,16 @@
           <w:rPr>
             <w:rStyle w:val="Hyperlink"/>
           </w:rPr>
-          <w:t>10. Halka Arz — Yaklaşan ve Devam Eden IPO’lar</w:t>
+          <w:t xml:space="preserve">10. Halka Arz — Yaklaşan ve Devam Eden </w:t>
         </w:r>
+        <w:proofErr w:type="spellStart"/>
+        <w:r>
+          <w:rPr>
+            <w:rStyle w:val="Hyperlink"/>
+          </w:rPr>
+          <w:t>IPO’lar</w:t>
+        </w:r>
+        <w:proofErr w:type="spellEnd"/>
       </w:hyperlink>
     </w:p>
     <w:p>
@@ -647,7 +665,21 @@
           <w:rPr>
             <w:rStyle w:val="Hyperlink"/>
           </w:rPr>
-          <w:t>11.2 Ex-Date Nedir, Neden Önemli?</w:t>
+          <w:t xml:space="preserve">11.2 </w:t>
+        </w:r>
+        <w:proofErr w:type="spellStart"/>
+        <w:r>
+          <w:rPr>
+            <w:rStyle w:val="Hyperlink"/>
+          </w:rPr>
+          <w:t>Ex-Date</w:t>
+        </w:r>
+        <w:proofErr w:type="spellEnd"/>
+        <w:r>
+          <w:rPr>
+            <w:rStyle w:val="Hyperlink"/>
+          </w:rPr>
+          <w:t xml:space="preserve"> Nedir, Neden Önemli?</w:t>
         </w:r>
       </w:hyperlink>
     </w:p>
@@ -699,19 +731,7 @@
           <w:rPr>
             <w:rStyle w:val="Hyperlink"/>
           </w:rPr>
-          <w:t>14. Sık</w:t>
-        </w:r>
-        <w:r>
-          <w:rPr>
-            <w:rStyle w:val="Hyperlink"/>
-          </w:rPr>
-          <w:t>ça</w:t>
-        </w:r>
-        <w:r>
-          <w:rPr>
-            <w:rStyle w:val="Hyperlink"/>
-          </w:rPr>
-          <w:t xml:space="preserve"> Sorulan Sorular</w:t>
+          <w:t>14. Sıkça Sorulan Sorular</w:t>
         </w:r>
       </w:hyperlink>
     </w:p>
@@ -733,7 +753,15 @@
     </w:p>
     <w:p>
       <w:r>
-        <w:t>TrendSurf Optima, Türkiye’deki beş temel varlık sınıfını — BIST hisseleri, TEFAS yatırım fonları, döviz kurları, kıymetli madenler ve kriptoparalar — tek bir ekranda birlikte değerlendiren, kişisel bir finansal takip ve sinyal terminalidir.</w:t>
+        <w:t xml:space="preserve">TrendSurf Optima, Türkiye’deki beş temel varlık sınıfını — BIST hisseleri, TEFAS yatırım fonları, döviz kurları, kıymetli madenler ve </w:t>
+      </w:r>
+      <w:proofErr w:type="spellStart"/>
+      <w:r>
+        <w:t>kriptoparalar</w:t>
+      </w:r>
+      <w:proofErr w:type="spellEnd"/>
+      <w:r>
+        <w:t xml:space="preserve"> — tek bir ekranda birlikte değerlendiren, kişisel bir finansal takip ve sinyal terminalidir.</w:t>
       </w:r>
     </w:p>
     <w:p>
@@ -749,7 +777,7 @@
         <w:pStyle w:val="BodyText"/>
       </w:pPr>
       <w:r>
-        <w:t>⚠ Yatırım Tavsiyesi Değildir</w:t>
+        <w:t>Yatırım Tavsiyesi Değildir</w:t>
       </w:r>
     </w:p>
     <w:p>
@@ -757,7 +785,15 @@
         <w:pStyle w:val="BodyText"/>
       </w:pPr>
       <w:r>
-        <w:t>TrendSurf Optima’daki hiçbir skor, sinyal, öneri veya hesaplama yatırım tavsiyesi niteliği taşımaz. Sistem, geçmiş ve güncel piyasa verilerini matematiksel olarak özetler. Tüm alım/satım kararları tamamen size aittir.</w:t>
+        <w:t xml:space="preserve">TrendSurf </w:t>
+      </w:r>
+      <w:proofErr w:type="spellStart"/>
+      <w:r>
+        <w:t>Optima’daki</w:t>
+      </w:r>
+      <w:proofErr w:type="spellEnd"/>
+      <w:r>
+        <w:t xml:space="preserve"> hiçbir skor, sinyal, öneri veya hesaplama yatırım tavsiyesi niteliği taşımaz. Sistem, geçmiş ve güncel piyasa verilerini matematiksel olarak özetler. Tüm alım/satım kararları tamamen size aittir.</w:t>
       </w:r>
     </w:p>
     <w:p>
@@ -776,13 +812,7 @@
     </w:p>
     <w:p>
       <w:r>
-        <w:t>Kılavuz, uygulamadaki sayfa sırasını takip eder. Her bölümde önce “ne işe yarar” sonra “nasıl okunur/hesaplanır” anlatılır. Kılavuzun sonundaki Terimler Sözlüğü ve Sık</w:t>
-      </w:r>
-      <w:r>
-        <w:t>ça</w:t>
-      </w:r>
-      <w:r>
-        <w:t xml:space="preserve"> Sorulan Sorular bölümlerine, herhangi bir noktada aklınıza takılan bir terim veya sorun için doğrudan atlayabilirsiniz.</w:t>
+        <w:t>Kılavuz, uygulamadaki sayfa sırasını takip eder. Her bölümde önce “ne işe yarar” sonra “nasıl okunur/hesaplanır” anlatılır. Kılavuzun sonundaki Terimler Sözlüğü ve Sıkça Sorulan Sorular bölümlerine, herhangi bir noktada aklınıza takılan bir terim veya sorun için doğrudan atlayabilirsiniz.</w:t>
       </w:r>
     </w:p>
     <w:p/>
@@ -826,7 +856,15 @@
         </w:numPr>
       </w:pPr>
       <w:r>
-        <w:t>Ad Soyad, e-posta ve şifrenizi girin (en az 8 karakter).</w:t>
+        <w:t xml:space="preserve">Ad </w:t>
+      </w:r>
+      <w:proofErr w:type="spellStart"/>
+      <w:r>
+        <w:t>Soyad</w:t>
+      </w:r>
+      <w:proofErr w:type="spellEnd"/>
+      <w:r>
+        <w:t>, e-posta ve şifrenizi girin (en az 8 karakter).</w:t>
       </w:r>
     </w:p>
     <w:p>
@@ -928,7 +966,7 @@
     </w:p>
     <w:p>
       <w:r>
-        <w:t>ⓘ Neden Onay Bekliyorum?</w:t>
+        <w:t>Neden Onay Bekliyorum?</w:t>
       </w:r>
     </w:p>
     <w:p>
@@ -936,7 +974,15 @@
         <w:pStyle w:val="BodyText"/>
       </w:pPr>
       <w:r>
-        <w:t>TrendSurf Optima davetle büyüyen, küçük ölçekli bir platformdur. Her yeni hesap, sistem yöneticisi tarafından manuel onaylanır. Bu, hem güvenlik hem de sistem kaynaklarının kontrollü kullanımı içindir.</w:t>
+        <w:t xml:space="preserve">TrendSurf Optima davetle büyüyen, küçük ölçekli bir platformdur. Her yeni hesap, sistem yöneticisi tarafından manuel onaylanır. </w:t>
+      </w:r>
+      <w:proofErr w:type="gramStart"/>
+      <w:r>
+        <w:t>Bu,</w:t>
+      </w:r>
+      <w:proofErr w:type="gramEnd"/>
+      <w:r>
+        <w:t xml:space="preserve"> hem güvenlik hem de sistem kaynaklarının kontrollü kullanımı içindir.</w:t>
       </w:r>
     </w:p>
     <w:p/>
@@ -1063,9 +1109,14 @@
             <w:tcW w:w="0" w:type="auto"/>
           </w:tcPr>
           <w:p>
+            <w:proofErr w:type="spellStart"/>
             <w:r>
               <w:lastRenderedPageBreak/>
-              <w:t>Max Varlık Sayısı</w:t>
+              <w:t>Max</w:t>
+            </w:r>
+            <w:proofErr w:type="spellEnd"/>
+            <w:r>
+              <w:t xml:space="preserve"> Varlık Sayısı</w:t>
             </w:r>
           </w:p>
         </w:tc>
@@ -1544,12 +1595,6 @@
           <w:szCs w:val="20"/>
         </w:rPr>
         <w:tab/>
-      </w:r>
-      <w:r>
-        <w:rPr>
-          <w:sz w:val="20"/>
-          <w:szCs w:val="20"/>
-        </w:rPr>
         <w:t>Yükseliş trendi + RSI 35-65 arası</w:t>
       </w:r>
       <w:r>
@@ -1619,12 +1664,6 @@
           <w:szCs w:val="20"/>
         </w:rPr>
         <w:tab/>
-      </w:r>
-      <w:r>
-        <w:rPr>
-          <w:sz w:val="20"/>
-          <w:szCs w:val="20"/>
-        </w:rPr>
         <w:t>(koşul sağlanmazsa)</w:t>
       </w:r>
       <w:r>
@@ -1708,12 +1747,6 @@
           <w:szCs w:val="20"/>
         </w:rPr>
         <w:tab/>
-      </w:r>
-      <w:r>
-        <w:rPr>
-          <w:sz w:val="20"/>
-          <w:szCs w:val="20"/>
-        </w:rPr>
         <w:t>Yükseliş trendi VEYA RSI 35-65 arası</w:t>
       </w:r>
       <w:r>
@@ -1783,12 +1816,6 @@
           <w:szCs w:val="20"/>
         </w:rPr>
         <w:tab/>
-      </w:r>
-      <w:r>
-        <w:rPr>
-          <w:sz w:val="20"/>
-          <w:szCs w:val="20"/>
-        </w:rPr>
         <w:t>(koşul sağlanmazsa)</w:t>
       </w:r>
       <w:r>
@@ -1877,12 +1904,6 @@
           <w:szCs w:val="20"/>
         </w:rPr>
         <w:tab/>
-      </w:r>
-      <w:r>
-        <w:rPr>
-          <w:sz w:val="20"/>
-          <w:szCs w:val="20"/>
-        </w:rPr>
         <w:t>Düşüş trendi + RSI&gt;70 (aşırı alım ama zayıflayan)</w:t>
       </w:r>
       <w:r>
@@ -1938,12 +1959,6 @@
           <w:szCs w:val="20"/>
         </w:rPr>
         <w:tab/>
-      </w:r>
-      <w:r>
-        <w:rPr>
-          <w:sz w:val="20"/>
-          <w:szCs w:val="20"/>
-        </w:rPr>
         <w:t>(koşul sağlanmazsa)</w:t>
       </w:r>
       <w:r>
@@ -2032,12 +2047,6 @@
           <w:szCs w:val="20"/>
         </w:rPr>
         <w:tab/>
-      </w:r>
-      <w:r>
-        <w:rPr>
-          <w:sz w:val="20"/>
-          <w:szCs w:val="20"/>
-        </w:rPr>
         <w:t>—</w:t>
       </w:r>
       <w:r>
@@ -2110,13 +2119,7 @@
         <w:pStyle w:val="BodyText"/>
       </w:pPr>
       <w:r>
-        <w:t xml:space="preserve">ⓘ </w:t>
-      </w:r>
-      <w:r>
-        <w:t>T</w:t>
-      </w:r>
-      <w:r>
-        <w:t>ablodaki varlığın solundaki kutucuğu işaretleyin.</w:t>
+        <w:t>Tablodaki varlığın solundaki kutucuğu işaretleyin.</w:t>
       </w:r>
     </w:p>
     <w:p>
@@ -2124,13 +2127,7 @@
         <w:pStyle w:val="BodyText"/>
       </w:pPr>
       <w:r>
-        <w:t xml:space="preserve">Tabloda bir </w:t>
-      </w:r>
-      <w:r>
-        <w:t>varlığın solundaki kutucuğu</w:t>
-      </w:r>
-      <w:r>
-        <w:t xml:space="preserve"> seçtiğinizde, sayfanın altında o varlığın fiyat grafiği, teknik göstergeleri ve detaylı analizi açılır.</w:t>
+        <w:t>Tabloda bir varlığın solundaki kutucuğu seçtiğinizde, sayfanın altında o varlığın fiyat grafiği, teknik göstergeleri ve detaylı analizi açılır.</w:t>
       </w:r>
     </w:p>
     <w:p>
@@ -2179,7 +2176,7 @@
         <w:pStyle w:val="BodyText"/>
       </w:pPr>
       <w:r>
-        <w:t>✓ Neden Önemli?</w:t>
+        <w:t>Neden Önemli?</w:t>
       </w:r>
     </w:p>
     <w:p>
@@ -2247,7 +2244,23 @@
           <w:b/>
           <w:bCs/>
         </w:rPr>
-        <w:t>BIST (temettü) ve Kripto (staking APY):</w:t>
+        <w:t>BIST (temettü) ve Kripto (</w:t>
+      </w:r>
+      <w:proofErr w:type="spellStart"/>
+      <w:r>
+        <w:rPr>
+          <w:b/>
+          <w:bCs/>
+        </w:rPr>
+        <w:t>staking</w:t>
+      </w:r>
+      <w:proofErr w:type="spellEnd"/>
+      <w:r>
+        <w:rPr>
+          <w:b/>
+          <w:bCs/>
+        </w:rPr>
+        <w:t xml:space="preserve"> APY):</w:t>
       </w:r>
       <w:r>
         <w:t xml:space="preserve"> Gerçek, açıklanmış verilere dayanır — güvenilir bir tahmindir.</w:t>
@@ -2279,7 +2292,7 @@
     <w:p>
       <w:r>
         <w:lastRenderedPageBreak/>
-        <w:t>⚠ TEFAS/Döviz/Maden Kısmı Spekülatiftir</w:t>
+        <w:t>TEFAS/Döviz/Maden Kısmı Spekülatiftir</w:t>
       </w:r>
     </w:p>
     <w:p>
@@ -2287,7 +2300,15 @@
         <w:pStyle w:val="BodyText"/>
       </w:pPr>
       <w:r>
-        <w:t>Kısa vadeli bir getirinin 12 aya yayılması, gerçek bir gelir garantisi değildir — sadece “bu ay bu hızda gitti” varsayımının basit bir projeksiyonudur. Yüksek bir “Bütçeye Oranı” (örn. %100’ün üzerinde) gördüğünüzde, bunun büyük ölçüde bu spekülatif kısımdan geldiğini unutmayın. Yatırım tavsiyesi değildir.</w:t>
+        <w:t>Kısa vadeli bir getirinin 12 aya yayılması, gerçek bir gelir garantisi değildir — sadece “bu ay bu hızda gitti” varsayımının basit bir projeksiyonudur. Yüksek bir “Bütçeye Oranı” (</w:t>
+      </w:r>
+      <w:proofErr w:type="spellStart"/>
+      <w:r>
+        <w:t>örn</w:t>
+      </w:r>
+      <w:proofErr w:type="spellEnd"/>
+      <w:r>
+        <w:t>. %100’ün üzerinde) gördüğünüzde, bunun büyük ölçüde bu spekülatif kısımdan geldiğini unutmayın. Yatırım tavsiyesi değildir.</w:t>
       </w:r>
     </w:p>
     <w:p>
@@ -2313,7 +2334,15 @@
         </w:numPr>
       </w:pPr>
       <w:r>
-        <w:t>RSI Zonu — %25 ağırlık. Aşırı satım bölgesi (RSI &lt; 30) yüksek puan alır.</w:t>
+        <w:t xml:space="preserve">RSI Zonu — %25 ağırlık. Aşırı satım bölgesi (RSI </w:t>
+      </w:r>
+      <w:proofErr w:type="gramStart"/>
+      <w:r>
+        <w:t>&lt; 30</w:t>
+      </w:r>
+      <w:proofErr w:type="gramEnd"/>
+      <w:r>
+        <w:t>) yüksek puan alır.</w:t>
       </w:r>
     </w:p>
     <w:p>
@@ -2351,7 +2380,23 @@
     </w:p>
     <w:p>
       <w:r>
-        <w:t>Skor, uygulama genelinde tek kaynaktan gelir: Ana Sayfa önerileri, BIST listesi, Portföyüm ve detay sayfası, aynı varlık için her zaman aynı Optima Skoru’nu gösterir. Fırsat Radarı’nın alarm e-postaları da (bkz. Bölüm 6) aynı formülü kullanır.</w:t>
+        <w:t xml:space="preserve">Skor, uygulama genelinde tek kaynaktan gelir: Ana Sayfa önerileri, BIST listesi, Portföyüm ve detay sayfası, aynı varlık için her zaman aynı Optima </w:t>
+      </w:r>
+      <w:proofErr w:type="spellStart"/>
+      <w:r>
+        <w:t>Skoru’nu</w:t>
+      </w:r>
+      <w:proofErr w:type="spellEnd"/>
+      <w:r>
+        <w:t xml:space="preserve"> gösterir. Fırsat </w:t>
+      </w:r>
+      <w:proofErr w:type="spellStart"/>
+      <w:r>
+        <w:t>Radarı’nın</w:t>
+      </w:r>
+      <w:proofErr w:type="spellEnd"/>
+      <w:r>
+        <w:t xml:space="preserve"> alarm e-postaları da (bkz. Bölüm 6) aynı formülü kullanır.</w:t>
       </w:r>
     </w:p>
     <w:p/>
@@ -2383,7 +2428,23 @@
     </w:p>
     <w:p>
       <w:r>
-        <w:t>Tabloda bir satır seçtiğinizde, sayfanın altında o varlığa özel bir detaylı analiz bölümü açılır: mum grafiği (candlestick chart), işlem hacmi göstergesi, teknik göstergeler (MA20/MA50, 52 Haftalık Yüksek/Düşük, MACD) ve Optima Skoru’nun bileşenlerine ayrıldığı bir skor dökümü yer alır.</w:t>
+        <w:t>Tabloda bir satır seçtiğinizde, sayfanın altında o varlığa özel bir detaylı analiz bölümü açılır: mum grafiği (</w:t>
+      </w:r>
+      <w:proofErr w:type="spellStart"/>
+      <w:r>
+        <w:t>candlestick</w:t>
+      </w:r>
+      <w:proofErr w:type="spellEnd"/>
+      <w:r>
+        <w:t xml:space="preserve"> </w:t>
+      </w:r>
+      <w:proofErr w:type="spellStart"/>
+      <w:r>
+        <w:t>chart</w:t>
+      </w:r>
+      <w:proofErr w:type="spellEnd"/>
+      <w:r>
+        <w:t>), işlem hacmi göstergesi, teknik göstergeler (MA20/MA50, 52 Haftalık Yüksek/Düşük, MACD) ve Optima Skoru’nun bileşenlerine ayrıldığı bir skor dökümü yer alır.</w:t>
       </w:r>
     </w:p>
     <w:p/>
@@ -2393,7 +2454,15 @@
       </w:pPr>
       <w:bookmarkStart w:id="15" w:name="mum-grafiği-candlestick-nasıl-okunur"/>
       <w:r>
-        <w:t>Mum Grafiği (Candlestick) Nasıl Okunur?</w:t>
+        <w:t>Mum Grafiği (</w:t>
+      </w:r>
+      <w:proofErr w:type="spellStart"/>
+      <w:r>
+        <w:t>Candlestick</w:t>
+      </w:r>
+      <w:proofErr w:type="spellEnd"/>
+      <w:r>
+        <w:t>) Nasıl Okunur?</w:t>
       </w:r>
     </w:p>
     <w:p>
@@ -2551,12 +2620,8 @@
       <w:bookmarkEnd w:id="7"/>
       <w:bookmarkEnd w:id="14"/>
       <w:bookmarkEnd w:id="17"/>
-    </w:p>
-    <w:p>
-      <w:pPr>
-        <w:pStyle w:val="Heading1"/>
-      </w:pPr>
-      <w:r>
+      <w:r>
+        <w:lastRenderedPageBreak/>
         <w:t>4. Portföyüm — Pozisyon Takibi</w:t>
       </w:r>
     </w:p>
@@ -2605,7 +2670,15 @@
         </w:numPr>
       </w:pPr>
       <w:r>
-        <w:t>Kutu boş açılır — yazarak arayın veya listeden varlık seçin (örn: GARAN, USD/TRY, ATOM). Bir şey seçene kadar formun geri kalanı görünmez.</w:t>
+        <w:t>Kutu boş açılır — yazarak arayın veya listeden varlık seçin (</w:t>
+      </w:r>
+      <w:proofErr w:type="spellStart"/>
+      <w:r>
+        <w:t>örn</w:t>
+      </w:r>
+      <w:proofErr w:type="spellEnd"/>
+      <w:r>
+        <w:t>: GARAN, USD/TRY, ATOM). Bir şey seçene kadar formun geri kalanı görünmez.</w:t>
       </w:r>
     </w:p>
     <w:p>
@@ -2654,7 +2727,7 @@
     </w:p>
     <w:p>
       <w:r>
-        <w:t>ⓘ Türk Sayı Formatı</w:t>
+        <w:t>Türk Sayı Formatı</w:t>
       </w:r>
     </w:p>
     <w:p>
@@ -3005,7 +3078,7 @@
     </w:p>
     <w:p>
       <w:r>
-        <w:t>⚠ Dikkat</w:t>
+        <w:t>Dikkat</w:t>
       </w:r>
     </w:p>
     <w:p>
@@ -3045,7 +3118,15 @@
     </w:p>
     <w:p>
       <w:r>
-        <w:t>Sistem her gün ayarlayacağınız saatlerde, 2 kere otomatik olarak Optimizasyon ve Portföy raporu gönderir. Optimizasyon raporunda bir bütçe değeri girilmediyse, kendiliğinden 20.000 TL yatırım bütçesinin optimize edilerek dağıtıldığı tablo gönderilir. Optimizasyon tablosunun altında, önceden kayıt ettiğiniz Portföy raporunuz yer alır. Sidebar’daki “E-Posta Ayarları” panelinden gönderim saatlerini ayarlarsınız.</w:t>
+        <w:t xml:space="preserve">Sistem her gün ayarlayacağınız saatlerde, 2 kere otomatik olarak Optimizasyon ve Portföy raporu gönderir. Optimizasyon raporunda bir bütçe değeri girilmediyse, kendiliğinden 20.000 TL yatırım bütçesinin optimize edilerek dağıtıldığı tablo gönderilir. Optimizasyon tablosunun altında, önceden kayıt ettiğiniz Portföy raporunuz yer alır. </w:t>
+      </w:r>
+      <w:proofErr w:type="spellStart"/>
+      <w:r>
+        <w:t>Sidebar’daki</w:t>
+      </w:r>
+      <w:proofErr w:type="spellEnd"/>
+      <w:r>
+        <w:t xml:space="preserve"> “E-Posta Ayarları” panelinden gönderim saatlerini ayarlarsınız.</w:t>
       </w:r>
     </w:p>
     <w:p>
@@ -3056,7 +3137,15 @@
         </w:numPr>
       </w:pPr>
       <w:r>
-        <w:t>Birinci Gönderim Saati: Sabah raporu için (örn: 08:30).</w:t>
+        <w:t>Birinci Gönderim Saati: Sabah raporu için (</w:t>
+      </w:r>
+      <w:proofErr w:type="spellStart"/>
+      <w:r>
+        <w:t>örn</w:t>
+      </w:r>
+      <w:proofErr w:type="spellEnd"/>
+      <w:r>
+        <w:t>: 08:30).</w:t>
       </w:r>
     </w:p>
     <w:p>
@@ -3067,7 +3156,15 @@
         </w:numPr>
       </w:pPr>
       <w:r>
-        <w:t>İkinci Gönderim Saati: Akşam raporu için (örn: 17:00). Boş bırakırsanız sadece sabah raporu gelir.</w:t>
+        <w:t>İkinci Gönderim Saati: Akşam raporu için (</w:t>
+      </w:r>
+      <w:proofErr w:type="spellStart"/>
+      <w:r>
+        <w:t>örn</w:t>
+      </w:r>
+      <w:proofErr w:type="spellEnd"/>
+      <w:r>
+        <w:t>: 17:00). Boş bırakırsanız sadece sabah raporu gelir.</w:t>
       </w:r>
     </w:p>
     <w:p>
@@ -3114,7 +3211,15 @@
     </w:p>
     <w:p>
       <w:r>
-        <w:t>Portföyünüzdeki her varlığın gördüğü en yüksek fiyatı (“peak”) sürekli izler; bu tepe noktasından belirlediğiniz orandan fazla düşüş gerçekleştiğinde otomatik e-posta gönderir. Sistem, siz uygulamada olmasanız bile 7/24 arka planda çalışır.</w:t>
+        <w:t>Portföyünüzdeki her varlığın gördüğü en yüksek fiyatı (“</w:t>
+      </w:r>
+      <w:proofErr w:type="spellStart"/>
+      <w:r>
+        <w:t>peak</w:t>
+      </w:r>
+      <w:proofErr w:type="spellEnd"/>
+      <w:r>
+        <w:t>”) sürekli izler; bu tepe noktasından belirlediğiniz orandan fazla düşüş gerçekleştiğinde otomatik e-posta gönderir. Sistem, siz uygulamada olmasanız bile 7/24 arka planda çalışır.</w:t>
       </w:r>
     </w:p>
     <w:p/>
@@ -3203,8 +3308,13 @@
             <w:tcW w:w="0" w:type="auto"/>
           </w:tcPr>
           <w:p>
-            <w:r>
-              <w:t>Peak fiyattan kaç % düşüşte uyarı gelsin (önerilen: %3).</w:t>
+            <w:proofErr w:type="spellStart"/>
+            <w:r>
+              <w:t>Peak</w:t>
+            </w:r>
+            <w:proofErr w:type="spellEnd"/>
+            <w:r>
+              <w:t xml:space="preserve"> fiyattan kaç % düşüşte uyarı gelsin (önerilen: %3).</w:t>
             </w:r>
           </w:p>
         </w:tc>
@@ -3269,8 +3379,13 @@
             <w:tcW w:w="0" w:type="auto"/>
           </w:tcPr>
           <w:p>
-            <w:r>
-              <w:t>Peak Kırıldıkça (önerilen) / Bir Kez Gönder / Saatte Bir Tekrarla.</w:t>
+            <w:proofErr w:type="spellStart"/>
+            <w:r>
+              <w:t>Peak</w:t>
+            </w:r>
+            <w:proofErr w:type="spellEnd"/>
+            <w:r>
+              <w:t xml:space="preserve"> Kırıldıkça (önerilen) / Bir Kez Gönder / Saatte Bir Tekrarla.</w:t>
             </w:r>
           </w:p>
         </w:tc>
@@ -3291,8 +3406,13 @@
             <w:tcW w:w="0" w:type="auto"/>
           </w:tcPr>
           <w:p>
-            <w:r>
-              <w:t>Peak × (1−eşik) / Şu anki fiyat / Sadece bilgi (fiyat önerisi yok).</w:t>
+            <w:proofErr w:type="spellStart"/>
+            <w:r>
+              <w:t>Peak</w:t>
+            </w:r>
+            <w:proofErr w:type="spellEnd"/>
+            <w:r>
+              <w:t xml:space="preserve"> × (1−eşik) / Şu anki fiyat / Sadece bilgi (fiyat önerisi yok).</w:t>
             </w:r>
           </w:p>
           <w:p/>
@@ -3304,7 +3424,7 @@
         <w:pStyle w:val="BodyText"/>
       </w:pPr>
       <w:r>
-        <w:t>✓ Önerilen Başlangıç Ayarları</w:t>
+        <w:t>Önerilen Başlangıç Ayarları</w:t>
       </w:r>
     </w:p>
     <w:p>
@@ -3312,7 +3432,15 @@
         <w:pStyle w:val="BodyText"/>
       </w:pPr>
       <w:r>
-        <w:t>Uyarı sistemi: Aktif · Düşüş eşiği: %3 · Sadece kârdayken uyar: Açık · Kontrol sıklığı: 30 dk · Uyarı modu: Peak kırıldıkça. Bu ayarlarla sistem ortalama 1-2 günde bir uyarı verir.</w:t>
+        <w:t xml:space="preserve">Uyarı sistemi: Aktif · Düşüş eşiği: %3 · Sadece kârdayken uyar: Açık · Kontrol sıklığı: 30 dk · Uyarı modu: </w:t>
+      </w:r>
+      <w:proofErr w:type="spellStart"/>
+      <w:r>
+        <w:t>Peak</w:t>
+      </w:r>
+      <w:proofErr w:type="spellEnd"/>
+      <w:r>
+        <w:t xml:space="preserve"> kırıldıkça. Bu ayarlarla sistem ortalama 1-2 günde bir uyarı verir.</w:t>
       </w:r>
     </w:p>
     <w:p>
@@ -3326,7 +3454,15 @@
       </w:pPr>
       <w:bookmarkStart w:id="26" w:name="manuel-test-ve-peak-sıfırlama"/>
       <w:r>
-        <w:t>Manuel Test ve Peak Sıfırlama</w:t>
+        <w:t xml:space="preserve">Manuel Test ve </w:t>
+      </w:r>
+      <w:proofErr w:type="spellStart"/>
+      <w:r>
+        <w:t>Peak</w:t>
+      </w:r>
+      <w:proofErr w:type="spellEnd"/>
+      <w:r>
+        <w:t xml:space="preserve"> Sıfırlama</w:t>
       </w:r>
     </w:p>
     <w:p>
@@ -3359,7 +3495,15 @@
         </w:numPr>
       </w:pPr>
       <w:r>
-        <w:t>“Tüm Peak’leri Sıfırla” — portföyünüzde büyük değişiklik yaptığınızda kullanışlıdır; geri alınamaz.</w:t>
+        <w:t xml:space="preserve">“Tüm </w:t>
+      </w:r>
+      <w:proofErr w:type="spellStart"/>
+      <w:r>
+        <w:t>Peak’leri</w:t>
+      </w:r>
+      <w:proofErr w:type="spellEnd"/>
+      <w:r>
+        <w:t xml:space="preserve"> Sıfırla” — portföyünüzde büyük değişiklik yaptığınızda kullanışlıdır; geri alınamaz.</w:t>
       </w:r>
     </w:p>
     <w:p>
@@ -3379,7 +3523,15 @@
     </w:p>
     <w:p>
       <w:r>
-        <w:t>Cumartesi/Pazar günleri BIST, TEFAS, Döviz ve Maden piyasaları kapalı olduğundan, sistem hafta sonu sadece kripto varlıklar için kontrol yapar.</w:t>
+        <w:t>Cumartesi/</w:t>
+      </w:r>
+      <w:proofErr w:type="gramStart"/>
+      <w:r>
+        <w:t>Pazar</w:t>
+      </w:r>
+      <w:proofErr w:type="gramEnd"/>
+      <w:r>
+        <w:t xml:space="preserve"> günleri BIST, TEFAS, Döviz ve Maden piyasaları kapalı olduğundan, sistem hafta sonu sadece kripto varlıklar için kontrol yapar.</w:t>
       </w:r>
     </w:p>
     <w:p>
@@ -3403,7 +3555,15 @@
     <w:p/>
     <w:p>
       <w:r>
-        <w:t>Fırsat Radarı, siz uygulamada olmasanız bile arka planda çalışan bir tarama sistemidir: BIST’teki 772 hissenin tamamını seans saatlerinde 15 dakikada bir; döviz, değerli maden ve kripto varlıkları 7/24; TEFAS fonlarını ise her akşam NAV açıklandıktan sonra otomatik olarak değerlendirir. Amaç, takip etmediğiniz bir varlıkta koşullar ilginçleştiğinde bunu gözden kaçırmamanızdır.</w:t>
+        <w:t xml:space="preserve">Fırsat Radarı, siz uygulamada olmasanız bile arka planda çalışan bir tarama sistemidir: </w:t>
+      </w:r>
+      <w:proofErr w:type="spellStart"/>
+      <w:r>
+        <w:t>BIST’teki</w:t>
+      </w:r>
+      <w:proofErr w:type="spellEnd"/>
+      <w:r>
+        <w:t xml:space="preserve"> 772 hissenin tamamını seans saatlerinde 15 dakikada bir; döviz, değerli maden ve kripto varlıkları 7/24; TEFAS fonlarını ise her akşam NAV açıklandıktan sonra otomatik olarak değerlendirir. Amaç, takip etmediğiniz bir varlıkta koşullar ilginçleştiğinde bunu gözden kaçırmamanızdır.</w:t>
       </w:r>
     </w:p>
     <w:p/>
@@ -3436,7 +3596,7 @@
         <w:t>Eşik alarmı</w:t>
       </w:r>
       <w:r>
-        <w:t xml:space="preserve"> — bir varlığın Optima Skoru 75 eşiğini aşağıdan yukarı kestiğinde.</w:t>
+        <w:t xml:space="preserve"> — bir varlığın Optima Skoru 85 eşiğini aşağıdan yukarı kestiğinde.</w:t>
       </w:r>
     </w:p>
     <w:p>
@@ -3454,7 +3614,7 @@
         <w:t>Sıçrama alarmı</w:t>
       </w:r>
       <w:r>
-        <w:t xml:space="preserve"> — bir önceki ölçüme göre skor en az 10 puan artıp 55’in üzerine çıktığında.</w:t>
+        <w:t xml:space="preserve"> — bir önceki ölçüme göre skor en az 15 puan artıp 55’in üzerine çıktığında.</w:t>
       </w:r>
     </w:p>
     <w:p>
@@ -3475,7 +3635,7 @@
     </w:p>
     <w:p>
       <w:r>
-        <w:t>⚠ Önce Bunu Okuyun</w:t>
+        <w:t>Önce Bunu Okuyun</w:t>
       </w:r>
     </w:p>
     <w:p>
@@ -3601,7 +3761,7 @@
     </w:p>
     <w:p>
       <w:r>
-        <w:t>ⓘ Radar Bir Ön Eleme Hunisidir</w:t>
+        <w:t>Radar Bir Ön Eleme Hunisidir</w:t>
       </w:r>
     </w:p>
     <w:p>
@@ -3685,7 +3845,7 @@
     </w:p>
     <w:p>
       <w:r>
-        <w:t>ⓘ Veri Kaynağı</w:t>
+        <w:t>Veri Kaynağı</w:t>
       </w:r>
     </w:p>
     <w:p>
@@ -3856,7 +4016,7 @@
         </w:numPr>
       </w:pPr>
       <w:r>
-        <w:t>12 TRY bazlı kur izlenir: USD, EUR, GBP, CHF, JPY ve diğerleri.</w:t>
+        <w:t>63 TRY bazlı kur izlenir: USD, EUR, GBP, CHF, JPY ve 51 genişleme dövizi (RUB, AED, ZAR ve diğerleri).</w:t>
       </w:r>
       <w:bookmarkStart w:id="40" w:name="h30"/>
       <w:bookmarkEnd w:id="39"/>
@@ -3882,7 +4042,23 @@
         </w:numPr>
       </w:pPr>
       <w:r>
-        <w:t>10 maden: Altın (Gram), Gümüş (Gram), Platin, Paladyum, Bakır vb.</w:t>
+        <w:t xml:space="preserve">17 maden/sikke: Gram Altın, Gram Gümüş, Gram Platin, 5 altın sikke türü (Çeyrek, Yarım, Tam, Cumhuriyet, Ata) ve 9 ek altın türü (14/18 Ayar, Bilezik, </w:t>
+      </w:r>
+      <w:proofErr w:type="spellStart"/>
+      <w:r>
+        <w:t>İkibuçuk</w:t>
+      </w:r>
+      <w:proofErr w:type="spellEnd"/>
+      <w:r>
+        <w:t xml:space="preserve">, Beşli, </w:t>
+      </w:r>
+      <w:proofErr w:type="spellStart"/>
+      <w:r>
+        <w:t>Gremse</w:t>
+      </w:r>
+      <w:proofErr w:type="spellEnd"/>
+      <w:r>
+        <w:t>, Reşat, Hamit, Gram Has Altın).</w:t>
       </w:r>
     </w:p>
     <w:p>
@@ -3919,7 +4095,7 @@
         </w:numPr>
       </w:pPr>
       <w:r>
-        <w:t>18 kripto para: BTC, ETH, SOL, ADA, ATOM, AVAX, DOT, MATIC, TON vb.</w:t>
+        <w:t>188 kripto para: BTC, ETH, SOL, ADA, ATOM, AVAX, DOT, MATIC, TON ve diğerleri.</w:t>
       </w:r>
     </w:p>
     <w:p>
@@ -3952,25 +4128,34 @@
         </w:numPr>
       </w:pPr>
       <w:r>
-        <w:t>Kriptoların da BIST’de olduğu gibi işlem hacimleri grafikte gösterilmektedir.</w:t>
-      </w:r>
-    </w:p>
-    <w:p>
-      <w:r>
-        <w:br w:type="page"/>
+        <w:t xml:space="preserve">Kriptoların da </w:t>
+      </w:r>
+      <w:proofErr w:type="spellStart"/>
+      <w:r>
+        <w:t>BIST’de</w:t>
+      </w:r>
+      <w:proofErr w:type="spellEnd"/>
+      <w:r>
+        <w:t xml:space="preserve"> olduğu gibi işlem hacimleri grafikte gösterilmektedir.</w:t>
       </w:r>
     </w:p>
     <w:p>
       <w:pPr>
         <w:pStyle w:val="Heading1"/>
+        <w:ind w:left="0" w:firstLine="0"/>
       </w:pPr>
       <w:bookmarkStart w:id="42" w:name="h32"/>
       <w:bookmarkEnd w:id="38"/>
       <w:bookmarkEnd w:id="41"/>
       <w:r>
         <w:lastRenderedPageBreak/>
-        <w:t>10. Halka Arz — Yaklaşan ve Devam Eden IPO’lar</w:t>
-      </w:r>
+        <w:t xml:space="preserve">10. Halka Arz — Yaklaşan ve Devam Eden </w:t>
+      </w:r>
+      <w:proofErr w:type="spellStart"/>
+      <w:r>
+        <w:t>IPO’lar</w:t>
+      </w:r>
+      <w:proofErr w:type="spellEnd"/>
     </w:p>
     <w:p>
       <w:r>
@@ -4117,7 +4302,15 @@
           </w:tcPr>
           <w:p>
             <w:r>
-              <w:t>Sürecin aşaması (örn. “Onaylandı, Talep Toplanıyor”, “Yakında”)</w:t>
+              <w:t>Sürecin aşaması (</w:t>
+            </w:r>
+            <w:proofErr w:type="spellStart"/>
+            <w:r>
+              <w:t>örn</w:t>
+            </w:r>
+            <w:proofErr w:type="spellEnd"/>
+            <w:r>
+              <w:t>. “Onaylandı, Talep Toplanıyor”, “Yakında”)</w:t>
             </w:r>
           </w:p>
         </w:tc>
@@ -4161,7 +4354,15 @@
           </w:tcPr>
           <w:p>
             <w:r>
-              <w:t>Arz fiyatının, bağımsız değerleme yöntemlerine göre hesaplanan “gerçek değer”e göre iskontosu</w:t>
+              <w:t xml:space="preserve">Arz fiyatının, bağımsız değerleme yöntemlerine göre hesaplanan “gerçek </w:t>
+            </w:r>
+            <w:proofErr w:type="spellStart"/>
+            <w:r>
+              <w:t>değer”e</w:t>
+            </w:r>
+            <w:proofErr w:type="spellEnd"/>
+            <w:r>
+              <w:t xml:space="preserve"> göre iskontosu</w:t>
             </w:r>
           </w:p>
         </w:tc>
@@ -4227,7 +4428,15 @@
           </w:tcPr>
           <w:p>
             <w:r>
-              <w:t>Fiyat Tespit Raporu’nun KAP’taki orijinaline link</w:t>
+              <w:t xml:space="preserve">Fiyat Tespit Raporu’nun </w:t>
+            </w:r>
+            <w:proofErr w:type="spellStart"/>
+            <w:r>
+              <w:t>KAP’taki</w:t>
+            </w:r>
+            <w:proofErr w:type="spellEnd"/>
+            <w:r>
+              <w:t xml:space="preserve"> orijinaline link</w:t>
             </w:r>
           </w:p>
           <w:p/>
@@ -4284,7 +4493,7 @@
     </w:p>
     <w:p>
       <w:r>
-        <w:t>⚠ Bu Bir Yatırım Tavsiyesi Değildir</w:t>
+        <w:t>Bu Bir Yatırım Tavsiyesi Değildir</w:t>
       </w:r>
     </w:p>
     <w:p>
@@ -4312,7 +4521,15 @@
     </w:p>
     <w:p>
       <w:r>
-        <w:t>Fiyat Tespit Raporları KAP’ta genellikle taranmış (OCR gerektiren) PDF formatında yayınlanır. Bazı raporların görüntü kalitesi düşük olduğunda, sistem yanlış bir rakam üretip sizi yanıltmaktansa, o alanı bilinçli olarak boş bırakır. Bu, bir hata değil, güvenlik önlemidir.</w:t>
+        <w:t xml:space="preserve">Fiyat Tespit Raporları </w:t>
+      </w:r>
+      <w:proofErr w:type="spellStart"/>
+      <w:r>
+        <w:t>KAP’ta</w:t>
+      </w:r>
+      <w:proofErr w:type="spellEnd"/>
+      <w:r>
+        <w:t xml:space="preserve"> genellikle taranmış (OCR gerektiren) PDF formatında yayınlanır. Bazı raporların görüntü kalitesi düşük olduğunda, sistem yanlış bir rakam üretip sizi yanıltmaktansa, o alanı bilinçli olarak boş bırakır. Bu, bir hata değil, güvenlik önlemidir.</w:t>
       </w:r>
     </w:p>
     <w:p/>
@@ -4336,7 +4553,15 @@
         <w:pStyle w:val="BodyText"/>
       </w:pPr>
       <w:r>
-        <w:t>Başarıyla çıkarılan değerler kalıcı bir katmanda (veritabanı) saklanır: uygulama yeniden başlasa bile daha önce hesaplanmış Arz Fiyatı, İskonto, Graham ve Çarpan değerleri kaybolmaz, ilk açılışta otomatik geri gelir.</w:t>
+        <w:t>Başarıyla çıkarılan değerler kalıcı bir katmanda (</w:t>
+      </w:r>
+      <w:proofErr w:type="spellStart"/>
+      <w:r>
+        <w:t>veritabanı</w:t>
+      </w:r>
+      <w:proofErr w:type="spellEnd"/>
+      <w:r>
+        <w:t>) saklanır: uygulama yeniden başlasa bile daha önce hesaplanmış Arz Fiyatı, İskonto, Graham ve Çarpan değerleri kaybolmaz, ilk açılışta otomatik geri gelir.</w:t>
       </w:r>
     </w:p>
     <w:p>
@@ -4356,7 +4581,15 @@
     </w:p>
     <w:p>
       <w:r>
-        <w:t xml:space="preserve">Bir şirket halka arz sürecini tamamlayıp fiilen Borsa İstanbul’da işlem görmeye başladığında (BIST Halka Arz Endeksi’ne — XHARZ’a — resmen girdiğinde), sistem bunu otomatik olarak algılar: şirket hem </w:t>
+        <w:t xml:space="preserve">Bir şirket halka arz sürecini tamamlayıp fiilen Borsa İstanbul’da işlem görmeye başladığında (BIST Halka Arz Endeksi’ne — </w:t>
+      </w:r>
+      <w:proofErr w:type="spellStart"/>
+      <w:r>
+        <w:t>XHARZ’a</w:t>
+      </w:r>
+      <w:proofErr w:type="spellEnd"/>
+      <w:r>
+        <w:t xml:space="preserve"> — resmen girdiğinde), sistem bunu otomatik olarak algılar: şirket hem </w:t>
       </w:r>
       <w:r>
         <w:rPr>
@@ -4552,9 +4785,11 @@
             <w:tcW w:w="0" w:type="auto"/>
           </w:tcPr>
           <w:p>
+            <w:proofErr w:type="spellStart"/>
             <w:r>
               <w:t>Ex-Date</w:t>
             </w:r>
+            <w:proofErr w:type="spellEnd"/>
           </w:p>
         </w:tc>
         <w:tc>
@@ -4591,7 +4826,15 @@
               <w:t>YAKLAŞIYOR</w:t>
             </w:r>
             <w:r>
-              <w:t xml:space="preserve"> (ex-date bugün/ileride) veya </w:t>
+              <w:t xml:space="preserve"> (</w:t>
+            </w:r>
+            <w:proofErr w:type="spellStart"/>
+            <w:r>
+              <w:t>ex-date</w:t>
+            </w:r>
+            <w:proofErr w:type="spellEnd"/>
+            <w:r>
+              <w:t xml:space="preserve"> bugün/ileride) veya </w:t>
             </w:r>
             <w:r>
               <w:rPr>
@@ -4600,7 +4843,15 @@
               <w:t>GEÇTİ</w:t>
             </w:r>
             <w:r>
-              <w:t xml:space="preserve"> (ex-date geçmişte)</w:t>
+              <w:t xml:space="preserve"> (</w:t>
+            </w:r>
+            <w:proofErr w:type="spellStart"/>
+            <w:r>
+              <w:t>ex-date</w:t>
+            </w:r>
+            <w:proofErr w:type="spellEnd"/>
+            <w:r>
+              <w:t xml:space="preserve"> geçmişte)</w:t>
             </w:r>
           </w:p>
         </w:tc>
@@ -4724,12 +4975,33 @@
       <w:bookmarkStart w:id="50" w:name="h40"/>
       <w:bookmarkEnd w:id="49"/>
       <w:r>
-        <w:t>11.2 Ex-Date Nedir, Neden Önemli?</w:t>
-      </w:r>
-    </w:p>
-    <w:p>
-      <w:r>
-        <w:t>Ex-Date (haklardan düşme tarihi), temettüyü almak için hisseye en geç ne zamana kadar sahip olmanız gerektiğini belirtir. Temettüyü almak için hisseye bu tarihten önceki gün kapanışında sahip olunması gerekir; ex-date’te veya sonrasında yapılan alım, o dönemin temettüsünü kaçırır.</w:t>
+        <w:t xml:space="preserve">11.2 </w:t>
+      </w:r>
+      <w:proofErr w:type="spellStart"/>
+      <w:r>
+        <w:t>Ex-Date</w:t>
+      </w:r>
+      <w:proofErr w:type="spellEnd"/>
+      <w:r>
+        <w:t xml:space="preserve"> Nedir, Neden Önemli?</w:t>
+      </w:r>
+    </w:p>
+    <w:p>
+      <w:proofErr w:type="spellStart"/>
+      <w:r>
+        <w:t>Ex-Date</w:t>
+      </w:r>
+      <w:proofErr w:type="spellEnd"/>
+      <w:r>
+        <w:t xml:space="preserve"> (haklardan düşme tarihi), temettüyü almak için hisseye en geç ne zamana kadar sahip olmanız gerektiğini belirtir. Temettüyü almak için hisseye bu tarihten önceki gün kapanışında sahip olunması gerekir; </w:t>
+      </w:r>
+      <w:proofErr w:type="spellStart"/>
+      <w:r>
+        <w:t>ex-date’te</w:t>
+      </w:r>
+      <w:proofErr w:type="spellEnd"/>
+      <w:r>
+        <w:t xml:space="preserve"> veya sonrasında yapılan alım, o dönemin temettüsünü kaçırır.</w:t>
       </w:r>
     </w:p>
     <w:p>
@@ -4737,7 +5009,23 @@
         <w:pStyle w:val="BodyText"/>
       </w:pPr>
       <w:r>
-        <w:t xml:space="preserve">Veri kaynağının doğası gereği (yfinance), bir şirket bu yıl için henüz yeni bir temettü açıklamadıysa Ex-Date alanı </w:t>
+        <w:t>Veri kaynağının doğası gereği (</w:t>
+      </w:r>
+      <w:proofErr w:type="spellStart"/>
+      <w:r>
+        <w:t>yfinance</w:t>
+      </w:r>
+      <w:proofErr w:type="spellEnd"/>
+      <w:r>
+        <w:t xml:space="preserve">), bir şirket bu yıl için henüz yeni bir temettü açıklamadıysa </w:t>
+      </w:r>
+      <w:proofErr w:type="spellStart"/>
+      <w:r>
+        <w:t>Ex-Date</w:t>
+      </w:r>
+      <w:proofErr w:type="spellEnd"/>
+      <w:r>
+        <w:t xml:space="preserve"> alanı </w:t>
       </w:r>
       <w:r>
         <w:rPr>
@@ -4765,15 +5053,20 @@
         <w:pStyle w:val="BodyText"/>
       </w:pPr>
       <w:r>
-        <w:t>✓ Turuncu Vurgu</w:t>
+        <w:t>Turuncu Vurgu</w:t>
       </w:r>
     </w:p>
     <w:p>
       <w:pPr>
         <w:pStyle w:val="BodyText"/>
       </w:pPr>
-      <w:r>
-        <w:t>Ex-Date’e 14 gün veya daha az kalan satırlar tabloda turuncu renkle vurgulanır — bu, “harekete geçmeniz gereken” bir zaman penceresine işaret eder.</w:t>
+      <w:proofErr w:type="spellStart"/>
+      <w:r>
+        <w:t>Ex-Date’e</w:t>
+      </w:r>
+      <w:proofErr w:type="spellEnd"/>
+      <w:r>
+        <w:t xml:space="preserve"> 14 gün veya daha az kalan satırlar tabloda turuncu renkle vurgulanır — bu, “harekete geçmeniz gereken” bir zaman penceresine işaret eder.</w:t>
       </w:r>
     </w:p>
     <w:p>
@@ -4821,7 +5114,23 @@
           <w:b/>
           <w:bCs/>
         </w:rPr>
-        <w:t>2. Ex-date takvimi:</w:t>
+        <w:t xml:space="preserve">2. </w:t>
+      </w:r>
+      <w:proofErr w:type="spellStart"/>
+      <w:r>
+        <w:rPr>
+          <w:b/>
+          <w:bCs/>
+        </w:rPr>
+        <w:t>Ex-date</w:t>
+      </w:r>
+      <w:proofErr w:type="spellEnd"/>
+      <w:r>
+        <w:rPr>
+          <w:b/>
+          <w:bCs/>
+        </w:rPr>
+        <w:t xml:space="preserve"> takvimi:</w:t>
       </w:r>
       <w:r>
         <w:t xml:space="preserve"> Yaklaşan (turuncu vurgulu) ve yüksek verimli satırları filtreleyerek, o ayki temettü hakkını kaçırmadan almak istediğiniz hisselerin bir listesini çıkarabilirsiniz.</w:t>
@@ -5179,7 +5488,23 @@
           </w:tcPr>
           <w:p>
             <w:r>
-              <w:t>Bir hissenin piyasa (endeks) hareketlerine göre oynaklığı. Beta &gt; 1 endeksten daha oynak, Beta &lt; 1 endeksten daha az oynak demektir.</w:t>
+              <w:t xml:space="preserve">Bir hissenin piyasa (endeks) hareketlerine göre oynaklığı. </w:t>
+            </w:r>
+            <w:proofErr w:type="gramStart"/>
+            <w:r>
+              <w:t>Beta &gt;</w:t>
+            </w:r>
+            <w:proofErr w:type="gramEnd"/>
+            <w:r>
+              <w:t xml:space="preserve"> 1 endeksten daha oynak, Beta </w:t>
+            </w:r>
+            <w:proofErr w:type="gramStart"/>
+            <w:r>
+              <w:t>&lt; 1</w:t>
+            </w:r>
+            <w:proofErr w:type="gramEnd"/>
+            <w:r>
+              <w:t xml:space="preserve"> endeksten daha az oynak demektir.</w:t>
             </w:r>
           </w:p>
         </w:tc>
@@ -5278,9 +5603,11 @@
             <w:tcW w:w="0" w:type="auto"/>
           </w:tcPr>
           <w:p>
+            <w:proofErr w:type="spellStart"/>
             <w:r>
               <w:t>Ex-Date</w:t>
             </w:r>
+            <w:proofErr w:type="spellEnd"/>
           </w:p>
         </w:tc>
         <w:tc>
@@ -5322,8 +5649,13 @@
             <w:tcW w:w="0" w:type="auto"/>
           </w:tcPr>
           <w:p>
-            <w:r>
-              <w:t>Peak (Tepe Fiyat)</w:t>
+            <w:proofErr w:type="spellStart"/>
+            <w:r>
+              <w:t>Peak</w:t>
+            </w:r>
+            <w:proofErr w:type="spellEnd"/>
+            <w:r>
+              <w:t xml:space="preserve"> (Tepe Fiyat)</w:t>
             </w:r>
           </w:p>
         </w:tc>
@@ -5367,7 +5699,6 @@
         <w:br w:type="page"/>
       </w:r>
     </w:p>
-    <w:p/>
     <w:p>
       <w:pPr>
         <w:pStyle w:val="Heading1"/>
@@ -5375,13 +5706,8 @@
       <w:bookmarkStart w:id="54" w:name="h44"/>
       <w:bookmarkEnd w:id="53"/>
       <w:r>
-        <w:t>14. Sık</w:t>
-      </w:r>
-      <w:r>
-        <w:t>ça</w:t>
-      </w:r>
-      <w:r>
-        <w:t xml:space="preserve"> Sorulan Sorular</w:t>
+        <w:lastRenderedPageBreak/>
+        <w:t>14. Sıkça Sorulan Sorular</w:t>
       </w:r>
     </w:p>
     <w:p>
@@ -5410,7 +5736,15 @@
     </w:p>
     <w:p>
       <w:r>
-        <w:t>Portföyünüz güvenli bir veritabanında saklanır, kaybolmaz. Çıkış yapıp tekrar giriş yapmayı deneyin; sorun devam ederse sistem yöneticisiyle iletişime geçin.</w:t>
+        <w:t xml:space="preserve">Portföyünüz güvenli bir </w:t>
+      </w:r>
+      <w:proofErr w:type="spellStart"/>
+      <w:r>
+        <w:t>veritabanında</w:t>
+      </w:r>
+      <w:proofErr w:type="spellEnd"/>
+      <w:r>
+        <w:t xml:space="preserve"> saklanır, kaybolmaz. Çıkış yapıp tekrar giriş yapmayı deneyin; sorun devam ederse sistem yöneticisiyle iletişime geçin.</w:t>
       </w:r>
     </w:p>
     <w:p>
@@ -5440,7 +5774,15 @@
     </w:p>
     <w:p>
       <w:r>
-        <w:t>Uyarı tekrar modunuza bağlıdır: “Peak Kırıldıkça” modunda aynı tepe için bir kez, yeni bir tepe oluşursa tekrar gelir.</w:t>
+        <w:t>Uyarı tekrar modunuza bağlıdır: “</w:t>
+      </w:r>
+      <w:proofErr w:type="spellStart"/>
+      <w:r>
+        <w:t>Peak</w:t>
+      </w:r>
+      <w:proofErr w:type="spellEnd"/>
+      <w:r>
+        <w:t xml:space="preserve"> Kırıldıkça” modunda aynı tepe için bir kez, yeni bir tepe oluşursa tekrar gelir.</w:t>
       </w:r>
     </w:p>
     <w:p>
@@ -5450,7 +5792,15 @@
       <w:bookmarkStart w:id="59" w:name="X7f77d8f892c149629f9a638dc762f9c17d09cd9"/>
       <w:bookmarkEnd w:id="58"/>
       <w:r>
-        <w:t>Fırsat Radarı’ndan alarm geldi — hemen almalı mıyım?</w:t>
+        <w:t xml:space="preserve">Fırsat </w:t>
+      </w:r>
+      <w:proofErr w:type="spellStart"/>
+      <w:r>
+        <w:t>Radarı’ndan</w:t>
+      </w:r>
+      <w:proofErr w:type="spellEnd"/>
+      <w:r>
+        <w:t xml:space="preserve"> alarm geldi — hemen almalı mıyım?</w:t>
       </w:r>
     </w:p>
     <w:p>
@@ -5510,7 +5860,15 @@
       <w:bookmarkStart w:id="63" w:name="X068fca355e45d46a67efc73512c06ab2402e158"/>
       <w:bookmarkEnd w:id="62"/>
       <w:r>
-        <w:t>Ana Sayfa’daki tablo mobilde neden farklı görünüyor?</w:t>
+        <w:t xml:space="preserve">Ana </w:t>
+      </w:r>
+      <w:proofErr w:type="spellStart"/>
+      <w:r>
+        <w:t>Sayfa’daki</w:t>
+      </w:r>
+      <w:proofErr w:type="spellEnd"/>
+      <w:r>
+        <w:t xml:space="preserve"> tablo mobilde neden farklı görünüyor?</w:t>
       </w:r>
     </w:p>
     <w:p>
@@ -5605,13 +5963,41 @@
       </w:rPr>
       <w:t xml:space="preserve">   </w:t>
     </w:r>
+    <w:proofErr w:type="spellStart"/>
     <w:r>
       <w:rPr>
         <w:rFonts w:ascii="Arial Narrow" w:hAnsi="Arial Narrow" w:cs="Arial Narrow"/>
         <w:color w:val="FFFFFF"/>
         <w:sz w:val="20"/>
       </w:rPr>
-      <w:t>Prepared by Bahri Güler</w:t>
+      <w:t>Prepared</w:t>
+    </w:r>
+    <w:proofErr w:type="spellEnd"/>
+    <w:r>
+      <w:rPr>
+        <w:rFonts w:ascii="Arial Narrow" w:hAnsi="Arial Narrow" w:cs="Arial Narrow"/>
+        <w:color w:val="FFFFFF"/>
+        <w:sz w:val="20"/>
+      </w:rPr>
+      <w:t xml:space="preserve"> </w:t>
+    </w:r>
+    <w:proofErr w:type="spellStart"/>
+    <w:r>
+      <w:rPr>
+        <w:rFonts w:ascii="Arial Narrow" w:hAnsi="Arial Narrow" w:cs="Arial Narrow"/>
+        <w:color w:val="FFFFFF"/>
+        <w:sz w:val="20"/>
+      </w:rPr>
+      <w:t>by</w:t>
+    </w:r>
+    <w:proofErr w:type="spellEnd"/>
+    <w:r>
+      <w:rPr>
+        <w:rFonts w:ascii="Arial Narrow" w:hAnsi="Arial Narrow" w:cs="Arial Narrow"/>
+        <w:color w:val="FFFFFF"/>
+        <w:sz w:val="20"/>
+      </w:rPr>
+      <w:t xml:space="preserve"> Bahri Güler</w:t>
     </w:r>
     <w:r>
       <w:rPr>

</xml_diff>